<commit_message>
Hlavičky TPEG2 a 14823-2 podle popisovaného vydání
Rok a počet stran podle iso.org, řádek „Zavedena v ČSN jako …“ podle
katalogu ČSN, třídicí znak TPEG2 01 8259. 21219-17, -18 a -19 nesou
označení ISO 21219-x (mezinárodní norma). 14823-2 bez třídicího znaku
(české vydání neexistuje).

Co-Authored-By: Claude Opus 5.5 <noreply@anthropic.com>
Claude-Session: https://claude.ai/code/session_013XsG4Ss77xGbwrRyA4pUBh
</commit_message>
<xml_diff>
--- a/extrakty/doc/TC278WG4/extract_14823-2_(2024).docx
+++ b/extrakty/doc/TC278WG4/extract_14823-2_(2024).docx
@@ -283,7 +283,7 @@
                 <w:szCs w:val="28"/>
                 <w:rtl w:val="0"/>
               </w:rPr>
-              <w:t xml:space="preserve">01 8388</w:t>
+              <w:t xml:space="preserve"/>
             </w:r>
             <w:r>
               <w:rPr>
@@ -321,7 +321,7 @@
           <w:szCs w:val="28"/>
           <w:rtl w:val="0"/>
         </w:rPr>
-        <w:t xml:space="preserve">Vydána 20</w:t>
+        <w:t xml:space="preserve">Vydána 2019, 26 stran</w:t>
       </w:r>
       <w:r>
         <w:rPr>
@@ -329,7 +329,7 @@
           <w:szCs w:val="28"/>
           <w:rtl w:val="0"/>
         </w:rPr>
-        <w:t xml:space="preserve">18</w:t>
+        <w:t xml:space="preserve"/>
       </w:r>
       <w:r>
         <w:rPr>
@@ -338,7 +338,7 @@
           <w:szCs w:val="28"/>
           <w:rtl w:val="0"/>
         </w:rPr>
-        <w:t xml:space="preserve">, 34 stran</w:t>
+        <w:t xml:space="preserve"/>
       </w:r>
       <w:r>
         <w:rPr>

</xml_diff>